<commit_message>
data preprocessing CKD - hands on - modified
</commit_message>
<xml_diff>
--- a/CKD - Analysis.docx
+++ b/CKD - Analysis.docx
@@ -1685,1717 +1685,45 @@
         <w:t>Overview table</w:t>
       </w:r>
     </w:p>
-    <w:tbl>
-      <w:tblPr>
-        <w:tblW w:w="7160" w:type="dxa"/>
-        <w:tblLook w:val="04A0" w:firstRow="1" w:lastRow="0" w:firstColumn="1" w:lastColumn="0" w:noHBand="0" w:noVBand="1"/>
-      </w:tblPr>
-      <w:tblGrid>
-        <w:gridCol w:w="1001"/>
-        <w:gridCol w:w="1600"/>
-        <w:gridCol w:w="1566"/>
-        <w:gridCol w:w="1600"/>
-        <w:gridCol w:w="1400"/>
-      </w:tblGrid>
-      <w:tr>
-        <w:trPr>
-          <w:trHeight w:val="690"/>
-        </w:trPr>
-        <w:tc>
-          <w:tcPr>
-            <w:tcW w:w="960" w:type="dxa"/>
-            <w:tcBorders>
-              <w:top w:val="single" w:sz="4" w:space="0" w:color="auto"/>
-              <w:left w:val="single" w:sz="4" w:space="0" w:color="auto"/>
-              <w:bottom w:val="single" w:sz="4" w:space="0" w:color="auto"/>
-              <w:right w:val="single" w:sz="4" w:space="0" w:color="auto"/>
-            </w:tcBorders>
-            <w:shd w:val="clear" w:color="000000" w:fill="DCE6F1"/>
-            <w:vAlign w:val="center"/>
-            <w:hideMark/>
-          </w:tcPr>
-          <w:p>
-            <w:pPr>
-              <w:spacing w:after="0" w:line="240" w:lineRule="auto"/>
-              <w:jc w:val="center"/>
-              <w:rPr>
-                <w:rFonts w:ascii="Calibri" w:eastAsia="Times New Roman" w:hAnsi="Calibri" w:cs="Calibri"/>
-                <w:b/>
-                <w:bCs/>
-                <w:color w:val="000000"/>
-                <w:kern w:val="0"/>
-                <w:lang w:eastAsia="en-GB"/>
-                <w14:ligatures w14:val="none"/>
-              </w:rPr>
-            </w:pPr>
-            <w:r>
-              <w:rPr>
-                <w:rFonts w:ascii="Calibri" w:eastAsia="Times New Roman" w:hAnsi="Calibri" w:cs="Calibri"/>
-                <w:b/>
-                <w:bCs/>
-                <w:color w:val="000000"/>
-                <w:kern w:val="0"/>
-                <w:lang w:eastAsia="en-GB"/>
-                <w14:ligatures w14:val="none"/>
-              </w:rPr>
-              <w:t>diabetes</w:t>
-            </w:r>
-          </w:p>
-        </w:tc>
-        <w:tc>
-          <w:tcPr>
-            <w:tcW w:w="1600" w:type="dxa"/>
-            <w:tcBorders>
-              <w:top w:val="single" w:sz="4" w:space="0" w:color="auto"/>
-              <w:left w:val="nil"/>
-              <w:bottom w:val="single" w:sz="4" w:space="0" w:color="auto"/>
-              <w:right w:val="single" w:sz="4" w:space="0" w:color="auto"/>
-            </w:tcBorders>
-            <w:shd w:val="clear" w:color="000000" w:fill="DCE6F1"/>
-            <w:vAlign w:val="center"/>
-            <w:hideMark/>
-          </w:tcPr>
-          <w:p>
-            <w:pPr>
-              <w:spacing w:after="0" w:line="240" w:lineRule="auto"/>
-              <w:jc w:val="center"/>
-              <w:rPr>
-                <w:rFonts w:ascii="Calibri" w:eastAsia="Times New Roman" w:hAnsi="Calibri" w:cs="Calibri"/>
-                <w:b/>
-                <w:bCs/>
-                <w:color w:val="000000"/>
-                <w:kern w:val="0"/>
-                <w:lang w:eastAsia="en-GB"/>
-                <w14:ligatures w14:val="none"/>
-              </w:rPr>
-            </w:pPr>
-            <w:r>
-              <w:rPr>
-                <w:rFonts w:ascii="Calibri" w:eastAsia="Times New Roman" w:hAnsi="Calibri" w:cs="Calibri"/>
-                <w:b/>
-                <w:bCs/>
-                <w:color w:val="000000"/>
-                <w:kern w:val="0"/>
-                <w:lang w:eastAsia="en-GB"/>
-                <w14:ligatures w14:val="none"/>
-              </w:rPr>
-              <w:t>kidney damage</w:t>
-            </w:r>
-          </w:p>
-        </w:tc>
-        <w:tc>
-          <w:tcPr>
-            <w:tcW w:w="1600" w:type="dxa"/>
-            <w:tcBorders>
-              <w:top w:val="single" w:sz="4" w:space="0" w:color="auto"/>
-              <w:left w:val="nil"/>
-              <w:bottom w:val="single" w:sz="4" w:space="0" w:color="auto"/>
-              <w:right w:val="single" w:sz="4" w:space="0" w:color="auto"/>
-            </w:tcBorders>
-            <w:shd w:val="clear" w:color="000000" w:fill="DCE6F1"/>
-            <w:vAlign w:val="center"/>
-            <w:hideMark/>
-          </w:tcPr>
-          <w:p>
-            <w:pPr>
-              <w:spacing w:after="0" w:line="240" w:lineRule="auto"/>
-              <w:jc w:val="center"/>
-              <w:rPr>
-                <w:rFonts w:ascii="Calibri" w:eastAsia="Times New Roman" w:hAnsi="Calibri" w:cs="Calibri"/>
-                <w:b/>
-                <w:bCs/>
-                <w:color w:val="000000"/>
-                <w:kern w:val="0"/>
-                <w:lang w:eastAsia="en-GB"/>
-                <w14:ligatures w14:val="none"/>
-              </w:rPr>
-            </w:pPr>
-            <w:proofErr w:type="gramStart"/>
-            <w:r>
-              <w:rPr>
-                <w:rFonts w:ascii="Calibri" w:eastAsia="Times New Roman" w:hAnsi="Calibri" w:cs="Calibri"/>
-                <w:b/>
-                <w:bCs/>
-                <w:color w:val="000000"/>
-                <w:kern w:val="0"/>
-                <w:lang w:eastAsia="en-GB"/>
-                <w14:ligatures w14:val="none"/>
-              </w:rPr>
-              <w:t>CKD  -</w:t>
-            </w:r>
-            <w:proofErr w:type="gramEnd"/>
-            <w:r>
-              <w:rPr>
-                <w:rFonts w:ascii="Calibri" w:eastAsia="Times New Roman" w:hAnsi="Calibri" w:cs="Calibri"/>
-                <w:b/>
-                <w:bCs/>
-                <w:color w:val="000000"/>
-                <w:kern w:val="0"/>
-                <w:lang w:eastAsia="en-GB"/>
-                <w14:ligatures w14:val="none"/>
-              </w:rPr>
-              <w:t xml:space="preserve"> major risk </w:t>
-            </w:r>
-          </w:p>
-        </w:tc>
-        <w:tc>
-          <w:tcPr>
-            <w:tcW w:w="1600" w:type="dxa"/>
-            <w:tcBorders>
-              <w:top w:val="single" w:sz="4" w:space="0" w:color="auto"/>
-              <w:left w:val="nil"/>
-              <w:bottom w:val="single" w:sz="4" w:space="0" w:color="auto"/>
-              <w:right w:val="single" w:sz="4" w:space="0" w:color="auto"/>
-            </w:tcBorders>
-            <w:shd w:val="clear" w:color="000000" w:fill="DCE6F1"/>
-            <w:vAlign w:val="center"/>
-            <w:hideMark/>
-          </w:tcPr>
-          <w:p>
-            <w:pPr>
-              <w:spacing w:after="0" w:line="240" w:lineRule="auto"/>
-              <w:jc w:val="center"/>
-              <w:rPr>
-                <w:rFonts w:ascii="Calibri" w:eastAsia="Times New Roman" w:hAnsi="Calibri" w:cs="Calibri"/>
-                <w:b/>
-                <w:bCs/>
-                <w:color w:val="000000"/>
-                <w:kern w:val="0"/>
-                <w:lang w:eastAsia="en-GB"/>
-                <w14:ligatures w14:val="none"/>
-              </w:rPr>
-            </w:pPr>
-            <w:r>
-              <w:rPr>
-                <w:rFonts w:ascii="Calibri" w:eastAsia="Times New Roman" w:hAnsi="Calibri" w:cs="Calibri"/>
-                <w:b/>
-                <w:bCs/>
-                <w:color w:val="000000"/>
-                <w:kern w:val="0"/>
-                <w:lang w:eastAsia="en-GB"/>
-                <w14:ligatures w14:val="none"/>
-              </w:rPr>
-              <w:t xml:space="preserve">Infection </w:t>
-            </w:r>
-            <w:proofErr w:type="spellStart"/>
-            <w:r>
-              <w:rPr>
-                <w:rFonts w:ascii="Calibri" w:eastAsia="Times New Roman" w:hAnsi="Calibri" w:cs="Calibri"/>
-                <w:b/>
-                <w:bCs/>
-                <w:color w:val="000000"/>
-                <w:kern w:val="0"/>
-                <w:lang w:eastAsia="en-GB"/>
-                <w14:ligatures w14:val="none"/>
-              </w:rPr>
-              <w:t>incators</w:t>
-            </w:r>
-            <w:proofErr w:type="spellEnd"/>
-          </w:p>
-        </w:tc>
-        <w:tc>
-          <w:tcPr>
-            <w:tcW w:w="1400" w:type="dxa"/>
-            <w:tcBorders>
-              <w:top w:val="single" w:sz="4" w:space="0" w:color="auto"/>
-              <w:left w:val="nil"/>
-              <w:bottom w:val="single" w:sz="4" w:space="0" w:color="auto"/>
-              <w:right w:val="single" w:sz="4" w:space="0" w:color="auto"/>
-            </w:tcBorders>
-            <w:shd w:val="clear" w:color="000000" w:fill="DCE6F1"/>
-            <w:vAlign w:val="center"/>
-            <w:hideMark/>
-          </w:tcPr>
-          <w:p>
-            <w:pPr>
-              <w:spacing w:after="0" w:line="240" w:lineRule="auto"/>
-              <w:jc w:val="center"/>
-              <w:rPr>
-                <w:rFonts w:ascii="Calibri" w:eastAsia="Times New Roman" w:hAnsi="Calibri" w:cs="Calibri"/>
-                <w:b/>
-                <w:bCs/>
-                <w:color w:val="000000"/>
-                <w:kern w:val="0"/>
-                <w:lang w:eastAsia="en-GB"/>
-                <w14:ligatures w14:val="none"/>
-              </w:rPr>
-            </w:pPr>
-            <w:r>
-              <w:rPr>
-                <w:rFonts w:ascii="Calibri" w:eastAsia="Times New Roman" w:hAnsi="Calibri" w:cs="Calibri"/>
-                <w:b/>
-                <w:bCs/>
-                <w:color w:val="000000"/>
-                <w:kern w:val="0"/>
-                <w:lang w:eastAsia="en-GB"/>
-                <w14:ligatures w14:val="none"/>
-              </w:rPr>
-              <w:t xml:space="preserve">CKD patients - </w:t>
-            </w:r>
-            <w:proofErr w:type="spellStart"/>
-            <w:r>
-              <w:rPr>
-                <w:rFonts w:ascii="Calibri" w:eastAsia="Times New Roman" w:hAnsi="Calibri" w:cs="Calibri"/>
-                <w:b/>
-                <w:bCs/>
-                <w:color w:val="000000"/>
-                <w:kern w:val="0"/>
-                <w:lang w:eastAsia="en-GB"/>
-                <w14:ligatures w14:val="none"/>
-              </w:rPr>
-              <w:t>anemia</w:t>
-            </w:r>
-            <w:proofErr w:type="spellEnd"/>
-            <w:r>
-              <w:rPr>
-                <w:rFonts w:ascii="Calibri" w:eastAsia="Times New Roman" w:hAnsi="Calibri" w:cs="Calibri"/>
-                <w:b/>
-                <w:bCs/>
-                <w:color w:val="000000"/>
-                <w:kern w:val="0"/>
-                <w:lang w:eastAsia="en-GB"/>
-                <w14:ligatures w14:val="none"/>
-              </w:rPr>
-              <w:t xml:space="preserve"> </w:t>
-            </w:r>
-          </w:p>
-        </w:tc>
-      </w:tr>
-      <w:tr>
-        <w:trPr>
-          <w:trHeight w:val="300"/>
-        </w:trPr>
-        <w:tc>
-          <w:tcPr>
-            <w:tcW w:w="960" w:type="dxa"/>
-            <w:tcBorders>
-              <w:top w:val="nil"/>
-              <w:left w:val="single" w:sz="4" w:space="0" w:color="auto"/>
-              <w:bottom w:val="single" w:sz="4" w:space="0" w:color="auto"/>
-              <w:right w:val="single" w:sz="4" w:space="0" w:color="auto"/>
-            </w:tcBorders>
-            <w:noWrap/>
-            <w:vAlign w:val="bottom"/>
-            <w:hideMark/>
-          </w:tcPr>
-          <w:p>
-            <w:pPr>
-              <w:spacing w:after="0" w:line="240" w:lineRule="auto"/>
-              <w:rPr>
-                <w:rFonts w:ascii="Calibri" w:eastAsia="Times New Roman" w:hAnsi="Calibri" w:cs="Calibri"/>
-                <w:color w:val="000000"/>
-                <w:kern w:val="0"/>
-                <w:lang w:eastAsia="en-GB"/>
-                <w14:ligatures w14:val="none"/>
-              </w:rPr>
-            </w:pPr>
-            <w:r>
-              <w:rPr>
-                <w:rFonts w:ascii="Calibri" w:eastAsia="Times New Roman" w:hAnsi="Calibri" w:cs="Calibri"/>
-                <w:color w:val="000000"/>
-                <w:kern w:val="0"/>
-                <w:lang w:eastAsia="en-GB"/>
-                <w14:ligatures w14:val="none"/>
-              </w:rPr>
-              <w:t xml:space="preserve">low </w:t>
-            </w:r>
-            <w:proofErr w:type="spellStart"/>
-            <w:r>
-              <w:rPr>
-                <w:rFonts w:ascii="Calibri" w:eastAsia="Times New Roman" w:hAnsi="Calibri" w:cs="Calibri"/>
-                <w:color w:val="000000"/>
-                <w:kern w:val="0"/>
-                <w:lang w:eastAsia="en-GB"/>
-                <w14:ligatures w14:val="none"/>
-              </w:rPr>
-              <w:t>su</w:t>
-            </w:r>
-            <w:proofErr w:type="spellEnd"/>
-          </w:p>
-        </w:tc>
-        <w:tc>
-          <w:tcPr>
-            <w:tcW w:w="1600" w:type="dxa"/>
-            <w:tcBorders>
-              <w:top w:val="nil"/>
-              <w:left w:val="nil"/>
-              <w:bottom w:val="single" w:sz="4" w:space="0" w:color="auto"/>
-              <w:right w:val="single" w:sz="4" w:space="0" w:color="auto"/>
-            </w:tcBorders>
-            <w:noWrap/>
-            <w:vAlign w:val="bottom"/>
-            <w:hideMark/>
-          </w:tcPr>
-          <w:p>
-            <w:pPr>
-              <w:spacing w:after="0" w:line="240" w:lineRule="auto"/>
-              <w:rPr>
-                <w:rFonts w:ascii="Calibri" w:eastAsia="Times New Roman" w:hAnsi="Calibri" w:cs="Calibri"/>
-                <w:color w:val="000000"/>
-                <w:kern w:val="0"/>
-                <w:lang w:eastAsia="en-GB"/>
-                <w14:ligatures w14:val="none"/>
-              </w:rPr>
-            </w:pPr>
-            <w:r>
-              <w:rPr>
-                <w:rFonts w:ascii="Calibri" w:eastAsia="Times New Roman" w:hAnsi="Calibri" w:cs="Calibri"/>
-                <w:color w:val="000000"/>
-                <w:kern w:val="0"/>
-                <w:lang w:eastAsia="en-GB"/>
-                <w14:ligatures w14:val="none"/>
-              </w:rPr>
-              <w:t xml:space="preserve">high BP </w:t>
-            </w:r>
-          </w:p>
-        </w:tc>
-        <w:tc>
-          <w:tcPr>
-            <w:tcW w:w="1600" w:type="dxa"/>
-            <w:tcBorders>
-              <w:top w:val="nil"/>
-              <w:left w:val="nil"/>
-              <w:bottom w:val="single" w:sz="4" w:space="0" w:color="auto"/>
-              <w:right w:val="single" w:sz="4" w:space="0" w:color="auto"/>
-            </w:tcBorders>
-            <w:vAlign w:val="bottom"/>
-            <w:hideMark/>
-          </w:tcPr>
-          <w:p>
-            <w:pPr>
-              <w:spacing w:after="0" w:line="240" w:lineRule="auto"/>
-              <w:rPr>
-                <w:rFonts w:ascii="Calibri" w:eastAsia="Times New Roman" w:hAnsi="Calibri" w:cs="Calibri"/>
-                <w:b/>
-                <w:bCs/>
-                <w:color w:val="FF0000"/>
-                <w:kern w:val="0"/>
-                <w:lang w:eastAsia="en-GB"/>
-                <w14:ligatures w14:val="none"/>
-              </w:rPr>
-            </w:pPr>
-            <w:r>
-              <w:rPr>
-                <w:rFonts w:ascii="Calibri" w:eastAsia="Times New Roman" w:hAnsi="Calibri" w:cs="Calibri"/>
-                <w:b/>
-                <w:bCs/>
-                <w:color w:val="FF0000"/>
-                <w:kern w:val="0"/>
-                <w:lang w:eastAsia="en-GB"/>
-                <w14:ligatures w14:val="none"/>
-              </w:rPr>
-              <w:t xml:space="preserve">high </w:t>
-            </w:r>
-            <w:proofErr w:type="spellStart"/>
-            <w:r>
-              <w:rPr>
-                <w:rFonts w:ascii="Calibri" w:eastAsia="Times New Roman" w:hAnsi="Calibri" w:cs="Calibri"/>
-                <w:b/>
-                <w:bCs/>
-                <w:color w:val="FF0000"/>
-                <w:kern w:val="0"/>
-                <w:lang w:eastAsia="en-GB"/>
-                <w14:ligatures w14:val="none"/>
-              </w:rPr>
-              <w:t>sc</w:t>
-            </w:r>
-            <w:proofErr w:type="spellEnd"/>
-          </w:p>
-        </w:tc>
-        <w:tc>
-          <w:tcPr>
-            <w:tcW w:w="1600" w:type="dxa"/>
-            <w:tcBorders>
-              <w:top w:val="nil"/>
-              <w:left w:val="nil"/>
-              <w:bottom w:val="single" w:sz="4" w:space="0" w:color="auto"/>
-              <w:right w:val="single" w:sz="4" w:space="0" w:color="auto"/>
-            </w:tcBorders>
-            <w:noWrap/>
-            <w:vAlign w:val="bottom"/>
-            <w:hideMark/>
-          </w:tcPr>
-          <w:p>
-            <w:pPr>
-              <w:spacing w:after="0" w:line="240" w:lineRule="auto"/>
-              <w:rPr>
-                <w:rFonts w:ascii="Calibri" w:eastAsia="Times New Roman" w:hAnsi="Calibri" w:cs="Calibri"/>
-                <w:color w:val="000000"/>
-                <w:kern w:val="0"/>
-                <w:lang w:eastAsia="en-GB"/>
-                <w14:ligatures w14:val="none"/>
-              </w:rPr>
-            </w:pPr>
-            <w:r>
-              <w:rPr>
-                <w:rFonts w:ascii="Calibri" w:eastAsia="Times New Roman" w:hAnsi="Calibri" w:cs="Calibri"/>
-                <w:color w:val="000000"/>
-                <w:kern w:val="0"/>
-                <w:lang w:eastAsia="en-GB"/>
-                <w14:ligatures w14:val="none"/>
-              </w:rPr>
-              <w:t>pc</w:t>
-            </w:r>
-          </w:p>
-        </w:tc>
-        <w:tc>
-          <w:tcPr>
-            <w:tcW w:w="1400" w:type="dxa"/>
-            <w:tcBorders>
-              <w:top w:val="nil"/>
-              <w:left w:val="nil"/>
-              <w:bottom w:val="single" w:sz="4" w:space="0" w:color="auto"/>
-              <w:right w:val="single" w:sz="4" w:space="0" w:color="auto"/>
-            </w:tcBorders>
-            <w:noWrap/>
-            <w:vAlign w:val="bottom"/>
-            <w:hideMark/>
-          </w:tcPr>
-          <w:p>
-            <w:pPr>
-              <w:spacing w:after="0" w:line="240" w:lineRule="auto"/>
-              <w:rPr>
-                <w:rFonts w:ascii="Calibri" w:eastAsia="Times New Roman" w:hAnsi="Calibri" w:cs="Calibri"/>
-                <w:color w:val="000000"/>
-                <w:kern w:val="0"/>
-                <w:lang w:eastAsia="en-GB"/>
-                <w14:ligatures w14:val="none"/>
-              </w:rPr>
-            </w:pPr>
-            <w:r>
-              <w:rPr>
-                <w:rFonts w:ascii="Calibri" w:eastAsia="Times New Roman" w:hAnsi="Calibri" w:cs="Calibri"/>
-                <w:color w:val="000000"/>
-                <w:kern w:val="0"/>
-                <w:lang w:eastAsia="en-GB"/>
-                <w14:ligatures w14:val="none"/>
-              </w:rPr>
-              <w:t xml:space="preserve">low </w:t>
-            </w:r>
-            <w:proofErr w:type="spellStart"/>
-            <w:r>
-              <w:rPr>
-                <w:rFonts w:ascii="Calibri" w:eastAsia="Times New Roman" w:hAnsi="Calibri" w:cs="Calibri"/>
-                <w:color w:val="000000"/>
-                <w:kern w:val="0"/>
-                <w:lang w:eastAsia="en-GB"/>
-                <w14:ligatures w14:val="none"/>
-              </w:rPr>
-              <w:t>hemo</w:t>
-            </w:r>
-            <w:proofErr w:type="spellEnd"/>
-          </w:p>
-        </w:tc>
-      </w:tr>
-      <w:tr>
-        <w:trPr>
-          <w:trHeight w:val="300"/>
-        </w:trPr>
-        <w:tc>
-          <w:tcPr>
-            <w:tcW w:w="960" w:type="dxa"/>
-            <w:tcBorders>
-              <w:top w:val="nil"/>
-              <w:left w:val="single" w:sz="4" w:space="0" w:color="auto"/>
-              <w:bottom w:val="single" w:sz="4" w:space="0" w:color="auto"/>
-              <w:right w:val="single" w:sz="4" w:space="0" w:color="auto"/>
-            </w:tcBorders>
-            <w:noWrap/>
-            <w:vAlign w:val="bottom"/>
-            <w:hideMark/>
-          </w:tcPr>
-          <w:p>
-            <w:pPr>
-              <w:spacing w:after="0" w:line="240" w:lineRule="auto"/>
-              <w:rPr>
-                <w:rFonts w:ascii="Calibri" w:eastAsia="Times New Roman" w:hAnsi="Calibri" w:cs="Calibri"/>
-                <w:color w:val="000000"/>
-                <w:kern w:val="0"/>
-                <w:lang w:eastAsia="en-GB"/>
-                <w14:ligatures w14:val="none"/>
-              </w:rPr>
-            </w:pPr>
-            <w:r>
-              <w:rPr>
-                <w:rFonts w:ascii="Calibri" w:eastAsia="Times New Roman" w:hAnsi="Calibri" w:cs="Calibri"/>
-                <w:color w:val="000000"/>
-                <w:kern w:val="0"/>
-                <w:lang w:eastAsia="en-GB"/>
-                <w14:ligatures w14:val="none"/>
-              </w:rPr>
-              <w:t xml:space="preserve">high </w:t>
-            </w:r>
-            <w:proofErr w:type="spellStart"/>
-            <w:r>
-              <w:rPr>
-                <w:rFonts w:ascii="Calibri" w:eastAsia="Times New Roman" w:hAnsi="Calibri" w:cs="Calibri"/>
-                <w:color w:val="000000"/>
-                <w:kern w:val="0"/>
-                <w:lang w:eastAsia="en-GB"/>
-                <w14:ligatures w14:val="none"/>
-              </w:rPr>
-              <w:t>bgr</w:t>
-            </w:r>
-            <w:proofErr w:type="spellEnd"/>
-            <w:r>
-              <w:rPr>
-                <w:rFonts w:ascii="Calibri" w:eastAsia="Times New Roman" w:hAnsi="Calibri" w:cs="Calibri"/>
-                <w:color w:val="000000"/>
-                <w:kern w:val="0"/>
-                <w:lang w:eastAsia="en-GB"/>
-                <w14:ligatures w14:val="none"/>
-              </w:rPr>
-              <w:t xml:space="preserve"> </w:t>
-            </w:r>
-          </w:p>
-        </w:tc>
-        <w:tc>
-          <w:tcPr>
-            <w:tcW w:w="1600" w:type="dxa"/>
-            <w:tcBorders>
-              <w:top w:val="nil"/>
-              <w:left w:val="nil"/>
-              <w:bottom w:val="single" w:sz="4" w:space="0" w:color="auto"/>
-              <w:right w:val="single" w:sz="4" w:space="0" w:color="auto"/>
-            </w:tcBorders>
-            <w:noWrap/>
-            <w:vAlign w:val="bottom"/>
-            <w:hideMark/>
-          </w:tcPr>
-          <w:p>
-            <w:pPr>
-              <w:spacing w:after="0" w:line="240" w:lineRule="auto"/>
-              <w:rPr>
-                <w:rFonts w:ascii="Calibri" w:eastAsia="Times New Roman" w:hAnsi="Calibri" w:cs="Calibri"/>
-                <w:color w:val="000000"/>
-                <w:kern w:val="0"/>
-                <w:lang w:eastAsia="en-GB"/>
-                <w14:ligatures w14:val="none"/>
-              </w:rPr>
-            </w:pPr>
-            <w:r>
-              <w:rPr>
-                <w:rFonts w:ascii="Calibri" w:eastAsia="Times New Roman" w:hAnsi="Calibri" w:cs="Calibri"/>
-                <w:color w:val="000000"/>
-                <w:kern w:val="0"/>
-                <w:lang w:eastAsia="en-GB"/>
-                <w14:ligatures w14:val="none"/>
-              </w:rPr>
-              <w:t>high al</w:t>
-            </w:r>
-          </w:p>
-        </w:tc>
-        <w:tc>
-          <w:tcPr>
-            <w:tcW w:w="1600" w:type="dxa"/>
-            <w:tcBorders>
-              <w:top w:val="nil"/>
-              <w:left w:val="nil"/>
-              <w:bottom w:val="single" w:sz="4" w:space="0" w:color="auto"/>
-              <w:right w:val="single" w:sz="4" w:space="0" w:color="auto"/>
-            </w:tcBorders>
-            <w:vAlign w:val="bottom"/>
-            <w:hideMark/>
-          </w:tcPr>
-          <w:p>
-            <w:pPr>
-              <w:spacing w:after="0" w:line="240" w:lineRule="auto"/>
-              <w:rPr>
-                <w:rFonts w:ascii="Calibri" w:eastAsia="Times New Roman" w:hAnsi="Calibri" w:cs="Calibri"/>
-                <w:b/>
-                <w:bCs/>
-                <w:color w:val="FF0000"/>
-                <w:kern w:val="0"/>
-                <w:lang w:eastAsia="en-GB"/>
-                <w14:ligatures w14:val="none"/>
-              </w:rPr>
-            </w:pPr>
-            <w:r>
-              <w:rPr>
-                <w:rFonts w:ascii="Calibri" w:eastAsia="Times New Roman" w:hAnsi="Calibri" w:cs="Calibri"/>
-                <w:b/>
-                <w:bCs/>
-                <w:color w:val="FF0000"/>
-                <w:kern w:val="0"/>
-                <w:lang w:eastAsia="en-GB"/>
-                <w14:ligatures w14:val="none"/>
-              </w:rPr>
-              <w:t xml:space="preserve">low </w:t>
-            </w:r>
-            <w:proofErr w:type="spellStart"/>
-            <w:r>
-              <w:rPr>
-                <w:rFonts w:ascii="Calibri" w:eastAsia="Times New Roman" w:hAnsi="Calibri" w:cs="Calibri"/>
-                <w:b/>
-                <w:bCs/>
-                <w:color w:val="FF0000"/>
-                <w:kern w:val="0"/>
-                <w:lang w:eastAsia="en-GB"/>
-                <w14:ligatures w14:val="none"/>
-              </w:rPr>
-              <w:t>pcv</w:t>
-            </w:r>
-            <w:proofErr w:type="spellEnd"/>
-          </w:p>
-        </w:tc>
-        <w:tc>
-          <w:tcPr>
-            <w:tcW w:w="1600" w:type="dxa"/>
-            <w:tcBorders>
-              <w:top w:val="nil"/>
-              <w:left w:val="nil"/>
-              <w:bottom w:val="single" w:sz="4" w:space="0" w:color="auto"/>
-              <w:right w:val="single" w:sz="4" w:space="0" w:color="auto"/>
-            </w:tcBorders>
-            <w:noWrap/>
-            <w:vAlign w:val="bottom"/>
-            <w:hideMark/>
-          </w:tcPr>
-          <w:p>
-            <w:pPr>
-              <w:spacing w:after="0" w:line="240" w:lineRule="auto"/>
-              <w:rPr>
-                <w:rFonts w:ascii="Calibri" w:eastAsia="Times New Roman" w:hAnsi="Calibri" w:cs="Calibri"/>
-                <w:color w:val="000000"/>
-                <w:kern w:val="0"/>
-                <w:lang w:eastAsia="en-GB"/>
-                <w14:ligatures w14:val="none"/>
-              </w:rPr>
-            </w:pPr>
-            <w:proofErr w:type="spellStart"/>
-            <w:r>
-              <w:rPr>
-                <w:rFonts w:ascii="Calibri" w:eastAsia="Times New Roman" w:hAnsi="Calibri" w:cs="Calibri"/>
-                <w:color w:val="000000"/>
-                <w:kern w:val="0"/>
-                <w:lang w:eastAsia="en-GB"/>
-                <w14:ligatures w14:val="none"/>
-              </w:rPr>
-              <w:t>pcc</w:t>
-            </w:r>
-            <w:proofErr w:type="spellEnd"/>
-          </w:p>
-        </w:tc>
-        <w:tc>
-          <w:tcPr>
-            <w:tcW w:w="1400" w:type="dxa"/>
-            <w:tcBorders>
-              <w:top w:val="nil"/>
-              <w:left w:val="nil"/>
-              <w:bottom w:val="single" w:sz="4" w:space="0" w:color="auto"/>
-              <w:right w:val="single" w:sz="4" w:space="0" w:color="auto"/>
-            </w:tcBorders>
-            <w:noWrap/>
-            <w:vAlign w:val="bottom"/>
-            <w:hideMark/>
-          </w:tcPr>
-          <w:p>
-            <w:pPr>
-              <w:spacing w:after="0" w:line="240" w:lineRule="auto"/>
-              <w:rPr>
-                <w:rFonts w:ascii="Calibri" w:eastAsia="Times New Roman" w:hAnsi="Calibri" w:cs="Calibri"/>
-                <w:color w:val="000000"/>
-                <w:kern w:val="0"/>
-                <w:lang w:eastAsia="en-GB"/>
-                <w14:ligatures w14:val="none"/>
-              </w:rPr>
-            </w:pPr>
-            <w:proofErr w:type="spellStart"/>
-            <w:r>
-              <w:rPr>
-                <w:rFonts w:ascii="Calibri" w:eastAsia="Times New Roman" w:hAnsi="Calibri" w:cs="Calibri"/>
-                <w:color w:val="000000"/>
-                <w:kern w:val="0"/>
-                <w:lang w:eastAsia="en-GB"/>
-                <w14:ligatures w14:val="none"/>
-              </w:rPr>
-              <w:t>ane</w:t>
-            </w:r>
-            <w:proofErr w:type="spellEnd"/>
-          </w:p>
-        </w:tc>
-      </w:tr>
-      <w:tr>
-        <w:trPr>
-          <w:trHeight w:val="300"/>
-        </w:trPr>
-        <w:tc>
-          <w:tcPr>
-            <w:tcW w:w="960" w:type="dxa"/>
-            <w:tcBorders>
-              <w:top w:val="nil"/>
-              <w:left w:val="single" w:sz="4" w:space="0" w:color="auto"/>
-              <w:bottom w:val="single" w:sz="4" w:space="0" w:color="auto"/>
-              <w:right w:val="single" w:sz="4" w:space="0" w:color="auto"/>
-            </w:tcBorders>
-            <w:noWrap/>
-            <w:vAlign w:val="bottom"/>
-            <w:hideMark/>
-          </w:tcPr>
-          <w:p>
-            <w:pPr>
-              <w:spacing w:after="0" w:line="240" w:lineRule="auto"/>
-              <w:rPr>
-                <w:rFonts w:ascii="Calibri" w:eastAsia="Times New Roman" w:hAnsi="Calibri" w:cs="Calibri"/>
-                <w:color w:val="000000"/>
-                <w:kern w:val="0"/>
-                <w:lang w:eastAsia="en-GB"/>
-                <w14:ligatures w14:val="none"/>
-              </w:rPr>
-            </w:pPr>
-            <w:r>
-              <w:rPr>
-                <w:rFonts w:ascii="Calibri" w:eastAsia="Times New Roman" w:hAnsi="Calibri" w:cs="Calibri"/>
-                <w:color w:val="000000"/>
-                <w:kern w:val="0"/>
-                <w:lang w:eastAsia="en-GB"/>
-                <w14:ligatures w14:val="none"/>
-              </w:rPr>
-              <w:t> </w:t>
-            </w:r>
-          </w:p>
-        </w:tc>
-        <w:tc>
-          <w:tcPr>
-            <w:tcW w:w="1600" w:type="dxa"/>
-            <w:tcBorders>
-              <w:top w:val="nil"/>
-              <w:left w:val="nil"/>
-              <w:bottom w:val="single" w:sz="4" w:space="0" w:color="auto"/>
-              <w:right w:val="single" w:sz="4" w:space="0" w:color="auto"/>
-            </w:tcBorders>
-            <w:noWrap/>
-            <w:vAlign w:val="bottom"/>
-            <w:hideMark/>
-          </w:tcPr>
-          <w:p>
-            <w:pPr>
-              <w:spacing w:after="0" w:line="240" w:lineRule="auto"/>
-              <w:rPr>
-                <w:rFonts w:ascii="Calibri" w:eastAsia="Times New Roman" w:hAnsi="Calibri" w:cs="Calibri"/>
-                <w:color w:val="000000"/>
-                <w:kern w:val="0"/>
-                <w:lang w:eastAsia="en-GB"/>
-                <w14:ligatures w14:val="none"/>
-              </w:rPr>
-            </w:pPr>
-            <w:r>
-              <w:rPr>
-                <w:rFonts w:ascii="Calibri" w:eastAsia="Times New Roman" w:hAnsi="Calibri" w:cs="Calibri"/>
-                <w:color w:val="000000"/>
-                <w:kern w:val="0"/>
-                <w:lang w:eastAsia="en-GB"/>
-                <w14:ligatures w14:val="none"/>
-              </w:rPr>
-              <w:t>low sg</w:t>
-            </w:r>
-          </w:p>
-        </w:tc>
-        <w:tc>
-          <w:tcPr>
-            <w:tcW w:w="1600" w:type="dxa"/>
-            <w:tcBorders>
-              <w:top w:val="nil"/>
-              <w:left w:val="nil"/>
-              <w:bottom w:val="single" w:sz="4" w:space="0" w:color="auto"/>
-              <w:right w:val="single" w:sz="4" w:space="0" w:color="auto"/>
-            </w:tcBorders>
-            <w:vAlign w:val="bottom"/>
-            <w:hideMark/>
-          </w:tcPr>
-          <w:p>
-            <w:pPr>
-              <w:spacing w:after="0" w:line="240" w:lineRule="auto"/>
-              <w:rPr>
-                <w:rFonts w:ascii="Calibri" w:eastAsia="Times New Roman" w:hAnsi="Calibri" w:cs="Calibri"/>
-                <w:b/>
-                <w:bCs/>
-                <w:color w:val="FF0000"/>
-                <w:kern w:val="0"/>
-                <w:lang w:eastAsia="en-GB"/>
-                <w14:ligatures w14:val="none"/>
-              </w:rPr>
-            </w:pPr>
-            <w:r>
-              <w:rPr>
-                <w:rFonts w:ascii="Calibri" w:eastAsia="Times New Roman" w:hAnsi="Calibri" w:cs="Calibri"/>
-                <w:b/>
-                <w:bCs/>
-                <w:color w:val="FF0000"/>
-                <w:kern w:val="0"/>
-                <w:lang w:eastAsia="en-GB"/>
-                <w14:ligatures w14:val="none"/>
-              </w:rPr>
-              <w:t xml:space="preserve">low </w:t>
-            </w:r>
-            <w:proofErr w:type="spellStart"/>
-            <w:r>
-              <w:rPr>
-                <w:rFonts w:ascii="Calibri" w:eastAsia="Times New Roman" w:hAnsi="Calibri" w:cs="Calibri"/>
-                <w:b/>
-                <w:bCs/>
-                <w:color w:val="FF0000"/>
-                <w:kern w:val="0"/>
-                <w:lang w:eastAsia="en-GB"/>
-                <w14:ligatures w14:val="none"/>
-              </w:rPr>
-              <w:t>rc</w:t>
-            </w:r>
-            <w:proofErr w:type="spellEnd"/>
-          </w:p>
-        </w:tc>
-        <w:tc>
-          <w:tcPr>
-            <w:tcW w:w="1600" w:type="dxa"/>
-            <w:tcBorders>
-              <w:top w:val="nil"/>
-              <w:left w:val="nil"/>
-              <w:bottom w:val="single" w:sz="4" w:space="0" w:color="auto"/>
-              <w:right w:val="single" w:sz="4" w:space="0" w:color="auto"/>
-            </w:tcBorders>
-            <w:noWrap/>
-            <w:vAlign w:val="bottom"/>
-            <w:hideMark/>
-          </w:tcPr>
-          <w:p>
-            <w:pPr>
-              <w:spacing w:after="0" w:line="240" w:lineRule="auto"/>
-              <w:rPr>
-                <w:rFonts w:ascii="Calibri" w:eastAsia="Times New Roman" w:hAnsi="Calibri" w:cs="Calibri"/>
-                <w:color w:val="000000"/>
-                <w:kern w:val="0"/>
-                <w:lang w:eastAsia="en-GB"/>
-                <w14:ligatures w14:val="none"/>
-              </w:rPr>
-            </w:pPr>
-            <w:proofErr w:type="spellStart"/>
-            <w:r>
-              <w:rPr>
-                <w:rFonts w:ascii="Calibri" w:eastAsia="Times New Roman" w:hAnsi="Calibri" w:cs="Calibri"/>
-                <w:color w:val="000000"/>
-                <w:kern w:val="0"/>
-                <w:lang w:eastAsia="en-GB"/>
-                <w14:ligatures w14:val="none"/>
-              </w:rPr>
-              <w:t>ba</w:t>
-            </w:r>
-            <w:proofErr w:type="spellEnd"/>
-          </w:p>
-        </w:tc>
-        <w:tc>
-          <w:tcPr>
-            <w:tcW w:w="1400" w:type="dxa"/>
-            <w:tcBorders>
-              <w:top w:val="nil"/>
-              <w:left w:val="nil"/>
-              <w:bottom w:val="single" w:sz="4" w:space="0" w:color="auto"/>
-              <w:right w:val="single" w:sz="4" w:space="0" w:color="auto"/>
-            </w:tcBorders>
-            <w:noWrap/>
-            <w:vAlign w:val="bottom"/>
-            <w:hideMark/>
-          </w:tcPr>
-          <w:p>
-            <w:pPr>
-              <w:spacing w:after="0" w:line="240" w:lineRule="auto"/>
-              <w:rPr>
-                <w:rFonts w:ascii="Calibri" w:eastAsia="Times New Roman" w:hAnsi="Calibri" w:cs="Calibri"/>
-                <w:color w:val="000000"/>
-                <w:kern w:val="0"/>
-                <w:lang w:eastAsia="en-GB"/>
-                <w14:ligatures w14:val="none"/>
-              </w:rPr>
-            </w:pPr>
-            <w:r>
-              <w:rPr>
-                <w:rFonts w:ascii="Calibri" w:eastAsia="Times New Roman" w:hAnsi="Calibri" w:cs="Calibri"/>
-                <w:color w:val="000000"/>
-                <w:kern w:val="0"/>
-                <w:lang w:eastAsia="en-GB"/>
-                <w14:ligatures w14:val="none"/>
-              </w:rPr>
-              <w:t> </w:t>
-            </w:r>
-          </w:p>
-        </w:tc>
-      </w:tr>
-      <w:tr>
-        <w:trPr>
-          <w:trHeight w:val="600"/>
-        </w:trPr>
-        <w:tc>
-          <w:tcPr>
-            <w:tcW w:w="960" w:type="dxa"/>
-            <w:tcBorders>
-              <w:top w:val="nil"/>
-              <w:left w:val="single" w:sz="4" w:space="0" w:color="auto"/>
-              <w:bottom w:val="single" w:sz="4" w:space="0" w:color="auto"/>
-              <w:right w:val="single" w:sz="4" w:space="0" w:color="auto"/>
-            </w:tcBorders>
-            <w:noWrap/>
-            <w:vAlign w:val="bottom"/>
-            <w:hideMark/>
-          </w:tcPr>
-          <w:p>
-            <w:pPr>
-              <w:spacing w:after="0" w:line="240" w:lineRule="auto"/>
-              <w:rPr>
-                <w:rFonts w:ascii="Calibri" w:eastAsia="Times New Roman" w:hAnsi="Calibri" w:cs="Calibri"/>
-                <w:color w:val="000000"/>
-                <w:kern w:val="0"/>
-                <w:lang w:eastAsia="en-GB"/>
-                <w14:ligatures w14:val="none"/>
-              </w:rPr>
-            </w:pPr>
-            <w:r>
-              <w:rPr>
-                <w:rFonts w:ascii="Calibri" w:eastAsia="Times New Roman" w:hAnsi="Calibri" w:cs="Calibri"/>
-                <w:color w:val="000000"/>
-                <w:kern w:val="0"/>
-                <w:lang w:eastAsia="en-GB"/>
-                <w14:ligatures w14:val="none"/>
-              </w:rPr>
-              <w:t> </w:t>
-            </w:r>
-          </w:p>
-        </w:tc>
-        <w:tc>
-          <w:tcPr>
-            <w:tcW w:w="1600" w:type="dxa"/>
-            <w:tcBorders>
-              <w:top w:val="nil"/>
-              <w:left w:val="nil"/>
-              <w:bottom w:val="single" w:sz="4" w:space="0" w:color="auto"/>
-              <w:right w:val="single" w:sz="4" w:space="0" w:color="auto"/>
-            </w:tcBorders>
-            <w:noWrap/>
-            <w:vAlign w:val="bottom"/>
-            <w:hideMark/>
-          </w:tcPr>
-          <w:p>
-            <w:pPr>
-              <w:spacing w:after="0" w:line="240" w:lineRule="auto"/>
-              <w:rPr>
-                <w:rFonts w:ascii="Calibri" w:eastAsia="Times New Roman" w:hAnsi="Calibri" w:cs="Calibri"/>
-                <w:color w:val="000000"/>
-                <w:kern w:val="0"/>
-                <w:lang w:eastAsia="en-GB"/>
-                <w14:ligatures w14:val="none"/>
-              </w:rPr>
-            </w:pPr>
-            <w:r>
-              <w:rPr>
-                <w:rFonts w:ascii="Calibri" w:eastAsia="Times New Roman" w:hAnsi="Calibri" w:cs="Calibri"/>
-                <w:color w:val="000000"/>
-                <w:kern w:val="0"/>
-                <w:lang w:eastAsia="en-GB"/>
-                <w14:ligatures w14:val="none"/>
-              </w:rPr>
-              <w:t>RBC abnormal</w:t>
-            </w:r>
-          </w:p>
-        </w:tc>
-        <w:tc>
-          <w:tcPr>
-            <w:tcW w:w="1600" w:type="dxa"/>
-            <w:tcBorders>
-              <w:top w:val="nil"/>
-              <w:left w:val="nil"/>
-              <w:bottom w:val="single" w:sz="4" w:space="0" w:color="auto"/>
-              <w:right w:val="single" w:sz="4" w:space="0" w:color="auto"/>
-            </w:tcBorders>
-            <w:vAlign w:val="bottom"/>
-            <w:hideMark/>
-          </w:tcPr>
-          <w:p>
-            <w:pPr>
-              <w:spacing w:after="0" w:line="240" w:lineRule="auto"/>
-              <w:rPr>
-                <w:rFonts w:ascii="Calibri" w:eastAsia="Times New Roman" w:hAnsi="Calibri" w:cs="Calibri"/>
-                <w:b/>
-                <w:bCs/>
-                <w:color w:val="FF0000"/>
-                <w:kern w:val="0"/>
-                <w:lang w:eastAsia="en-GB"/>
-                <w14:ligatures w14:val="none"/>
-              </w:rPr>
-            </w:pPr>
-            <w:proofErr w:type="spellStart"/>
-            <w:r>
-              <w:rPr>
-                <w:rFonts w:ascii="Calibri" w:eastAsia="Times New Roman" w:hAnsi="Calibri" w:cs="Calibri"/>
-                <w:b/>
-                <w:bCs/>
-                <w:color w:val="FF0000"/>
-                <w:kern w:val="0"/>
-                <w:lang w:eastAsia="en-GB"/>
-                <w14:ligatures w14:val="none"/>
-              </w:rPr>
-              <w:t>htn</w:t>
-            </w:r>
-            <w:proofErr w:type="spellEnd"/>
-            <w:r>
-              <w:rPr>
-                <w:rFonts w:ascii="Calibri" w:eastAsia="Times New Roman" w:hAnsi="Calibri" w:cs="Calibri"/>
-                <w:b/>
-                <w:bCs/>
-                <w:color w:val="FF0000"/>
-                <w:kern w:val="0"/>
-                <w:lang w:eastAsia="en-GB"/>
-                <w14:ligatures w14:val="none"/>
-              </w:rPr>
-              <w:t xml:space="preserve"> - (hypertension)</w:t>
-            </w:r>
-          </w:p>
-        </w:tc>
-        <w:tc>
-          <w:tcPr>
-            <w:tcW w:w="1600" w:type="dxa"/>
-            <w:tcBorders>
-              <w:top w:val="nil"/>
-              <w:left w:val="nil"/>
-              <w:bottom w:val="single" w:sz="4" w:space="0" w:color="auto"/>
-              <w:right w:val="single" w:sz="4" w:space="0" w:color="auto"/>
-            </w:tcBorders>
-            <w:noWrap/>
-            <w:vAlign w:val="bottom"/>
-            <w:hideMark/>
-          </w:tcPr>
-          <w:p>
-            <w:pPr>
-              <w:spacing w:after="0" w:line="240" w:lineRule="auto"/>
-              <w:rPr>
-                <w:rFonts w:ascii="Calibri" w:eastAsia="Times New Roman" w:hAnsi="Calibri" w:cs="Calibri"/>
-                <w:color w:val="000000"/>
-                <w:kern w:val="0"/>
-                <w:lang w:eastAsia="en-GB"/>
-                <w14:ligatures w14:val="none"/>
-              </w:rPr>
-            </w:pPr>
-            <w:proofErr w:type="spellStart"/>
-            <w:r>
-              <w:rPr>
-                <w:rFonts w:ascii="Calibri" w:eastAsia="Times New Roman" w:hAnsi="Calibri" w:cs="Calibri"/>
-                <w:color w:val="000000"/>
-                <w:kern w:val="0"/>
-                <w:lang w:eastAsia="en-GB"/>
-                <w14:ligatures w14:val="none"/>
-              </w:rPr>
-              <w:t>wc</w:t>
-            </w:r>
-            <w:proofErr w:type="spellEnd"/>
-          </w:p>
-        </w:tc>
-        <w:tc>
-          <w:tcPr>
-            <w:tcW w:w="1400" w:type="dxa"/>
-            <w:tcBorders>
-              <w:top w:val="nil"/>
-              <w:left w:val="nil"/>
-              <w:bottom w:val="single" w:sz="4" w:space="0" w:color="auto"/>
-              <w:right w:val="single" w:sz="4" w:space="0" w:color="auto"/>
-            </w:tcBorders>
-            <w:noWrap/>
-            <w:vAlign w:val="bottom"/>
-            <w:hideMark/>
-          </w:tcPr>
-          <w:p>
-            <w:pPr>
-              <w:spacing w:after="0" w:line="240" w:lineRule="auto"/>
-              <w:rPr>
-                <w:rFonts w:ascii="Calibri" w:eastAsia="Times New Roman" w:hAnsi="Calibri" w:cs="Calibri"/>
-                <w:color w:val="000000"/>
-                <w:kern w:val="0"/>
-                <w:lang w:eastAsia="en-GB"/>
-                <w14:ligatures w14:val="none"/>
-              </w:rPr>
-            </w:pPr>
-            <w:r>
-              <w:rPr>
-                <w:rFonts w:ascii="Calibri" w:eastAsia="Times New Roman" w:hAnsi="Calibri" w:cs="Calibri"/>
-                <w:color w:val="000000"/>
-                <w:kern w:val="0"/>
-                <w:lang w:eastAsia="en-GB"/>
-                <w14:ligatures w14:val="none"/>
-              </w:rPr>
-              <w:t> </w:t>
-            </w:r>
-          </w:p>
-        </w:tc>
-      </w:tr>
-      <w:tr>
-        <w:trPr>
-          <w:trHeight w:val="300"/>
-        </w:trPr>
-        <w:tc>
-          <w:tcPr>
-            <w:tcW w:w="960" w:type="dxa"/>
-            <w:tcBorders>
-              <w:top w:val="nil"/>
-              <w:left w:val="single" w:sz="4" w:space="0" w:color="auto"/>
-              <w:bottom w:val="single" w:sz="4" w:space="0" w:color="auto"/>
-              <w:right w:val="single" w:sz="4" w:space="0" w:color="auto"/>
-            </w:tcBorders>
-            <w:noWrap/>
-            <w:vAlign w:val="bottom"/>
-            <w:hideMark/>
-          </w:tcPr>
-          <w:p>
-            <w:pPr>
-              <w:spacing w:after="0" w:line="240" w:lineRule="auto"/>
-              <w:rPr>
-                <w:rFonts w:ascii="Calibri" w:eastAsia="Times New Roman" w:hAnsi="Calibri" w:cs="Calibri"/>
-                <w:color w:val="000000"/>
-                <w:kern w:val="0"/>
-                <w:lang w:eastAsia="en-GB"/>
-                <w14:ligatures w14:val="none"/>
-              </w:rPr>
-            </w:pPr>
-            <w:r>
-              <w:rPr>
-                <w:rFonts w:ascii="Calibri" w:eastAsia="Times New Roman" w:hAnsi="Calibri" w:cs="Calibri"/>
-                <w:color w:val="000000"/>
-                <w:kern w:val="0"/>
-                <w:lang w:eastAsia="en-GB"/>
-                <w14:ligatures w14:val="none"/>
-              </w:rPr>
-              <w:t> </w:t>
-            </w:r>
-          </w:p>
-        </w:tc>
-        <w:tc>
-          <w:tcPr>
-            <w:tcW w:w="1600" w:type="dxa"/>
-            <w:tcBorders>
-              <w:top w:val="nil"/>
-              <w:left w:val="nil"/>
-              <w:bottom w:val="single" w:sz="4" w:space="0" w:color="auto"/>
-              <w:right w:val="single" w:sz="4" w:space="0" w:color="auto"/>
-            </w:tcBorders>
-            <w:noWrap/>
-            <w:vAlign w:val="bottom"/>
-            <w:hideMark/>
-          </w:tcPr>
-          <w:p>
-            <w:pPr>
-              <w:spacing w:after="0" w:line="240" w:lineRule="auto"/>
-              <w:rPr>
-                <w:rFonts w:ascii="Calibri" w:eastAsia="Times New Roman" w:hAnsi="Calibri" w:cs="Calibri"/>
-                <w:color w:val="000000"/>
-                <w:kern w:val="0"/>
-                <w:lang w:eastAsia="en-GB"/>
-                <w14:ligatures w14:val="none"/>
-              </w:rPr>
-            </w:pPr>
-            <w:r>
-              <w:rPr>
-                <w:rFonts w:ascii="Calibri" w:eastAsia="Times New Roman" w:hAnsi="Calibri" w:cs="Calibri"/>
-                <w:color w:val="000000"/>
-                <w:kern w:val="0"/>
-                <w:lang w:eastAsia="en-GB"/>
-                <w14:ligatures w14:val="none"/>
-              </w:rPr>
-              <w:t xml:space="preserve">high </w:t>
-            </w:r>
-            <w:proofErr w:type="spellStart"/>
-            <w:r>
-              <w:rPr>
-                <w:rFonts w:ascii="Calibri" w:eastAsia="Times New Roman" w:hAnsi="Calibri" w:cs="Calibri"/>
-                <w:color w:val="000000"/>
-                <w:kern w:val="0"/>
-                <w:lang w:eastAsia="en-GB"/>
-                <w14:ligatures w14:val="none"/>
-              </w:rPr>
-              <w:t>bu</w:t>
-            </w:r>
-            <w:proofErr w:type="spellEnd"/>
-          </w:p>
-        </w:tc>
-        <w:tc>
-          <w:tcPr>
-            <w:tcW w:w="1600" w:type="dxa"/>
-            <w:tcBorders>
-              <w:top w:val="nil"/>
-              <w:left w:val="nil"/>
-              <w:bottom w:val="single" w:sz="4" w:space="0" w:color="auto"/>
-              <w:right w:val="single" w:sz="4" w:space="0" w:color="auto"/>
-            </w:tcBorders>
-            <w:vAlign w:val="bottom"/>
-            <w:hideMark/>
-          </w:tcPr>
-          <w:p>
-            <w:pPr>
-              <w:spacing w:after="0" w:line="240" w:lineRule="auto"/>
-              <w:rPr>
-                <w:rFonts w:ascii="Calibri" w:eastAsia="Times New Roman" w:hAnsi="Calibri" w:cs="Calibri"/>
-                <w:b/>
-                <w:bCs/>
-                <w:color w:val="FF0000"/>
-                <w:kern w:val="0"/>
-                <w:lang w:eastAsia="en-GB"/>
-                <w14:ligatures w14:val="none"/>
-              </w:rPr>
-            </w:pPr>
-            <w:r>
-              <w:rPr>
-                <w:rFonts w:ascii="Calibri" w:eastAsia="Times New Roman" w:hAnsi="Calibri" w:cs="Calibri"/>
-                <w:b/>
-                <w:bCs/>
-                <w:color w:val="FF0000"/>
-                <w:kern w:val="0"/>
-                <w:lang w:eastAsia="en-GB"/>
-                <w14:ligatures w14:val="none"/>
-              </w:rPr>
-              <w:t xml:space="preserve">dm </w:t>
-            </w:r>
-          </w:p>
-        </w:tc>
-        <w:tc>
-          <w:tcPr>
-            <w:tcW w:w="1600" w:type="dxa"/>
-            <w:tcBorders>
-              <w:top w:val="nil"/>
-              <w:left w:val="nil"/>
-              <w:bottom w:val="single" w:sz="4" w:space="0" w:color="auto"/>
-              <w:right w:val="single" w:sz="4" w:space="0" w:color="auto"/>
-            </w:tcBorders>
-            <w:noWrap/>
-            <w:vAlign w:val="bottom"/>
-            <w:hideMark/>
-          </w:tcPr>
-          <w:p>
-            <w:pPr>
-              <w:spacing w:after="0" w:line="240" w:lineRule="auto"/>
-              <w:rPr>
-                <w:rFonts w:ascii="Calibri" w:eastAsia="Times New Roman" w:hAnsi="Calibri" w:cs="Calibri"/>
-                <w:color w:val="000000"/>
-                <w:kern w:val="0"/>
-                <w:lang w:eastAsia="en-GB"/>
-                <w14:ligatures w14:val="none"/>
-              </w:rPr>
-            </w:pPr>
-            <w:r>
-              <w:rPr>
-                <w:rFonts w:ascii="Calibri" w:eastAsia="Times New Roman" w:hAnsi="Calibri" w:cs="Calibri"/>
-                <w:color w:val="000000"/>
-                <w:kern w:val="0"/>
-                <w:lang w:eastAsia="en-GB"/>
-                <w14:ligatures w14:val="none"/>
-              </w:rPr>
-              <w:t> </w:t>
-            </w:r>
-          </w:p>
-        </w:tc>
-        <w:tc>
-          <w:tcPr>
-            <w:tcW w:w="1400" w:type="dxa"/>
-            <w:tcBorders>
-              <w:top w:val="nil"/>
-              <w:left w:val="nil"/>
-              <w:bottom w:val="single" w:sz="4" w:space="0" w:color="auto"/>
-              <w:right w:val="single" w:sz="4" w:space="0" w:color="auto"/>
-            </w:tcBorders>
-            <w:noWrap/>
-            <w:vAlign w:val="bottom"/>
-            <w:hideMark/>
-          </w:tcPr>
-          <w:p>
-            <w:pPr>
-              <w:spacing w:after="0" w:line="240" w:lineRule="auto"/>
-              <w:rPr>
-                <w:rFonts w:ascii="Calibri" w:eastAsia="Times New Roman" w:hAnsi="Calibri" w:cs="Calibri"/>
-                <w:color w:val="000000"/>
-                <w:kern w:val="0"/>
-                <w:lang w:eastAsia="en-GB"/>
-                <w14:ligatures w14:val="none"/>
-              </w:rPr>
-            </w:pPr>
-            <w:r>
-              <w:rPr>
-                <w:rFonts w:ascii="Calibri" w:eastAsia="Times New Roman" w:hAnsi="Calibri" w:cs="Calibri"/>
-                <w:color w:val="000000"/>
-                <w:kern w:val="0"/>
-                <w:lang w:eastAsia="en-GB"/>
-                <w14:ligatures w14:val="none"/>
-              </w:rPr>
-              <w:t> </w:t>
-            </w:r>
-          </w:p>
-        </w:tc>
-      </w:tr>
-      <w:tr>
-        <w:trPr>
-          <w:trHeight w:val="300"/>
-        </w:trPr>
-        <w:tc>
-          <w:tcPr>
-            <w:tcW w:w="960" w:type="dxa"/>
-            <w:tcBorders>
-              <w:top w:val="nil"/>
-              <w:left w:val="single" w:sz="4" w:space="0" w:color="auto"/>
-              <w:bottom w:val="single" w:sz="4" w:space="0" w:color="auto"/>
-              <w:right w:val="single" w:sz="4" w:space="0" w:color="auto"/>
-            </w:tcBorders>
-            <w:noWrap/>
-            <w:vAlign w:val="bottom"/>
-            <w:hideMark/>
-          </w:tcPr>
-          <w:p>
-            <w:pPr>
-              <w:spacing w:after="0" w:line="240" w:lineRule="auto"/>
-              <w:rPr>
-                <w:rFonts w:ascii="Calibri" w:eastAsia="Times New Roman" w:hAnsi="Calibri" w:cs="Calibri"/>
-                <w:color w:val="000000"/>
-                <w:kern w:val="0"/>
-                <w:lang w:eastAsia="en-GB"/>
-                <w14:ligatures w14:val="none"/>
-              </w:rPr>
-            </w:pPr>
-            <w:r>
-              <w:rPr>
-                <w:rFonts w:ascii="Calibri" w:eastAsia="Times New Roman" w:hAnsi="Calibri" w:cs="Calibri"/>
-                <w:color w:val="000000"/>
-                <w:kern w:val="0"/>
-                <w:lang w:eastAsia="en-GB"/>
-                <w14:ligatures w14:val="none"/>
-              </w:rPr>
-              <w:t> </w:t>
-            </w:r>
-          </w:p>
-        </w:tc>
-        <w:tc>
-          <w:tcPr>
-            <w:tcW w:w="1600" w:type="dxa"/>
-            <w:tcBorders>
-              <w:top w:val="nil"/>
-              <w:left w:val="nil"/>
-              <w:bottom w:val="single" w:sz="4" w:space="0" w:color="auto"/>
-              <w:right w:val="single" w:sz="4" w:space="0" w:color="auto"/>
-            </w:tcBorders>
-            <w:noWrap/>
-            <w:vAlign w:val="bottom"/>
-            <w:hideMark/>
-          </w:tcPr>
-          <w:p>
-            <w:pPr>
-              <w:spacing w:after="0" w:line="240" w:lineRule="auto"/>
-              <w:rPr>
-                <w:rFonts w:ascii="Calibri" w:eastAsia="Times New Roman" w:hAnsi="Calibri" w:cs="Calibri"/>
-                <w:color w:val="000000"/>
-                <w:kern w:val="0"/>
-                <w:lang w:eastAsia="en-GB"/>
-                <w14:ligatures w14:val="none"/>
-              </w:rPr>
-            </w:pPr>
-            <w:r>
-              <w:rPr>
-                <w:rFonts w:ascii="Calibri" w:eastAsia="Times New Roman" w:hAnsi="Calibri" w:cs="Calibri"/>
-                <w:color w:val="000000"/>
-                <w:kern w:val="0"/>
-                <w:lang w:eastAsia="en-GB"/>
-                <w14:ligatures w14:val="none"/>
-              </w:rPr>
-              <w:t>sod abnormal</w:t>
-            </w:r>
-          </w:p>
-        </w:tc>
-        <w:tc>
-          <w:tcPr>
-            <w:tcW w:w="1600" w:type="dxa"/>
-            <w:tcBorders>
-              <w:top w:val="nil"/>
-              <w:left w:val="nil"/>
-              <w:bottom w:val="single" w:sz="4" w:space="0" w:color="auto"/>
-              <w:right w:val="single" w:sz="4" w:space="0" w:color="auto"/>
-            </w:tcBorders>
-            <w:vAlign w:val="bottom"/>
-            <w:hideMark/>
-          </w:tcPr>
-          <w:p>
-            <w:pPr>
-              <w:spacing w:after="0" w:line="240" w:lineRule="auto"/>
-              <w:rPr>
-                <w:rFonts w:ascii="Calibri" w:eastAsia="Times New Roman" w:hAnsi="Calibri" w:cs="Calibri"/>
-                <w:b/>
-                <w:bCs/>
-                <w:color w:val="FF0000"/>
-                <w:kern w:val="0"/>
-                <w:lang w:eastAsia="en-GB"/>
-                <w14:ligatures w14:val="none"/>
-              </w:rPr>
-            </w:pPr>
-            <w:r>
-              <w:rPr>
-                <w:rFonts w:ascii="Calibri" w:eastAsia="Times New Roman" w:hAnsi="Calibri" w:cs="Calibri"/>
-                <w:b/>
-                <w:bCs/>
-                <w:color w:val="FF0000"/>
-                <w:kern w:val="0"/>
-                <w:lang w:eastAsia="en-GB"/>
-                <w14:ligatures w14:val="none"/>
-              </w:rPr>
-              <w:t>poor appetite</w:t>
-            </w:r>
-          </w:p>
-        </w:tc>
-        <w:tc>
-          <w:tcPr>
-            <w:tcW w:w="1600" w:type="dxa"/>
-            <w:tcBorders>
-              <w:top w:val="nil"/>
-              <w:left w:val="nil"/>
-              <w:bottom w:val="single" w:sz="4" w:space="0" w:color="auto"/>
-              <w:right w:val="single" w:sz="4" w:space="0" w:color="auto"/>
-            </w:tcBorders>
-            <w:noWrap/>
-            <w:vAlign w:val="bottom"/>
-            <w:hideMark/>
-          </w:tcPr>
-          <w:p>
-            <w:pPr>
-              <w:spacing w:after="0" w:line="240" w:lineRule="auto"/>
-              <w:rPr>
-                <w:rFonts w:ascii="Calibri" w:eastAsia="Times New Roman" w:hAnsi="Calibri" w:cs="Calibri"/>
-                <w:color w:val="000000"/>
-                <w:kern w:val="0"/>
-                <w:lang w:eastAsia="en-GB"/>
-                <w14:ligatures w14:val="none"/>
-              </w:rPr>
-            </w:pPr>
-            <w:r>
-              <w:rPr>
-                <w:rFonts w:ascii="Calibri" w:eastAsia="Times New Roman" w:hAnsi="Calibri" w:cs="Calibri"/>
-                <w:color w:val="000000"/>
-                <w:kern w:val="0"/>
-                <w:lang w:eastAsia="en-GB"/>
-                <w14:ligatures w14:val="none"/>
-              </w:rPr>
-              <w:t> </w:t>
-            </w:r>
-          </w:p>
-        </w:tc>
-        <w:tc>
-          <w:tcPr>
-            <w:tcW w:w="1400" w:type="dxa"/>
-            <w:tcBorders>
-              <w:top w:val="nil"/>
-              <w:left w:val="nil"/>
-              <w:bottom w:val="single" w:sz="4" w:space="0" w:color="auto"/>
-              <w:right w:val="single" w:sz="4" w:space="0" w:color="auto"/>
-            </w:tcBorders>
-            <w:noWrap/>
-            <w:vAlign w:val="bottom"/>
-            <w:hideMark/>
-          </w:tcPr>
-          <w:p>
-            <w:pPr>
-              <w:spacing w:after="0" w:line="240" w:lineRule="auto"/>
-              <w:rPr>
-                <w:rFonts w:ascii="Calibri" w:eastAsia="Times New Roman" w:hAnsi="Calibri" w:cs="Calibri"/>
-                <w:color w:val="000000"/>
-                <w:kern w:val="0"/>
-                <w:lang w:eastAsia="en-GB"/>
-                <w14:ligatures w14:val="none"/>
-              </w:rPr>
-            </w:pPr>
-            <w:r>
-              <w:rPr>
-                <w:rFonts w:ascii="Calibri" w:eastAsia="Times New Roman" w:hAnsi="Calibri" w:cs="Calibri"/>
-                <w:color w:val="000000"/>
-                <w:kern w:val="0"/>
-                <w:lang w:eastAsia="en-GB"/>
-                <w14:ligatures w14:val="none"/>
-              </w:rPr>
-              <w:t> </w:t>
-            </w:r>
-          </w:p>
-        </w:tc>
-      </w:tr>
-      <w:tr>
-        <w:trPr>
-          <w:trHeight w:val="300"/>
-        </w:trPr>
-        <w:tc>
-          <w:tcPr>
-            <w:tcW w:w="960" w:type="dxa"/>
-            <w:tcBorders>
-              <w:top w:val="nil"/>
-              <w:left w:val="single" w:sz="4" w:space="0" w:color="auto"/>
-              <w:bottom w:val="single" w:sz="4" w:space="0" w:color="auto"/>
-              <w:right w:val="single" w:sz="4" w:space="0" w:color="auto"/>
-            </w:tcBorders>
-            <w:noWrap/>
-            <w:vAlign w:val="bottom"/>
-            <w:hideMark/>
-          </w:tcPr>
-          <w:p>
-            <w:pPr>
-              <w:spacing w:after="0" w:line="240" w:lineRule="auto"/>
-              <w:rPr>
-                <w:rFonts w:ascii="Calibri" w:eastAsia="Times New Roman" w:hAnsi="Calibri" w:cs="Calibri"/>
-                <w:color w:val="000000"/>
-                <w:kern w:val="0"/>
-                <w:lang w:eastAsia="en-GB"/>
-                <w14:ligatures w14:val="none"/>
-              </w:rPr>
-            </w:pPr>
-            <w:r>
-              <w:rPr>
-                <w:rFonts w:ascii="Calibri" w:eastAsia="Times New Roman" w:hAnsi="Calibri" w:cs="Calibri"/>
-                <w:color w:val="000000"/>
-                <w:kern w:val="0"/>
-                <w:lang w:eastAsia="en-GB"/>
-                <w14:ligatures w14:val="none"/>
-              </w:rPr>
-              <w:t> </w:t>
-            </w:r>
-          </w:p>
-        </w:tc>
-        <w:tc>
-          <w:tcPr>
-            <w:tcW w:w="1600" w:type="dxa"/>
-            <w:tcBorders>
-              <w:top w:val="nil"/>
-              <w:left w:val="nil"/>
-              <w:bottom w:val="single" w:sz="4" w:space="0" w:color="auto"/>
-              <w:right w:val="single" w:sz="4" w:space="0" w:color="auto"/>
-            </w:tcBorders>
-            <w:noWrap/>
-            <w:vAlign w:val="bottom"/>
-            <w:hideMark/>
-          </w:tcPr>
-          <w:p>
-            <w:pPr>
-              <w:spacing w:after="0" w:line="240" w:lineRule="auto"/>
-              <w:rPr>
-                <w:rFonts w:ascii="Calibri" w:eastAsia="Times New Roman" w:hAnsi="Calibri" w:cs="Calibri"/>
-                <w:color w:val="000000"/>
-                <w:kern w:val="0"/>
-                <w:lang w:eastAsia="en-GB"/>
-                <w14:ligatures w14:val="none"/>
-              </w:rPr>
-            </w:pPr>
-            <w:r>
-              <w:rPr>
-                <w:rFonts w:ascii="Calibri" w:eastAsia="Times New Roman" w:hAnsi="Calibri" w:cs="Calibri"/>
-                <w:color w:val="000000"/>
-                <w:kern w:val="0"/>
-                <w:lang w:eastAsia="en-GB"/>
-                <w14:ligatures w14:val="none"/>
-              </w:rPr>
-              <w:t>pe</w:t>
-            </w:r>
-          </w:p>
-        </w:tc>
-        <w:tc>
-          <w:tcPr>
-            <w:tcW w:w="1600" w:type="dxa"/>
-            <w:tcBorders>
-              <w:top w:val="nil"/>
-              <w:left w:val="nil"/>
-              <w:bottom w:val="single" w:sz="4" w:space="0" w:color="auto"/>
-              <w:right w:val="single" w:sz="4" w:space="0" w:color="auto"/>
-            </w:tcBorders>
-            <w:vAlign w:val="bottom"/>
-            <w:hideMark/>
-          </w:tcPr>
-          <w:p>
-            <w:pPr>
-              <w:spacing w:after="0" w:line="240" w:lineRule="auto"/>
-              <w:rPr>
-                <w:rFonts w:ascii="Calibri" w:eastAsia="Times New Roman" w:hAnsi="Calibri" w:cs="Calibri"/>
-                <w:color w:val="FF0000"/>
-                <w:kern w:val="0"/>
-                <w:lang w:eastAsia="en-GB"/>
-                <w14:ligatures w14:val="none"/>
-              </w:rPr>
-            </w:pPr>
-            <w:r>
-              <w:rPr>
-                <w:rFonts w:ascii="Calibri" w:eastAsia="Times New Roman" w:hAnsi="Calibri" w:cs="Calibri"/>
-                <w:color w:val="FF0000"/>
-                <w:kern w:val="0"/>
-                <w:lang w:eastAsia="en-GB"/>
-                <w14:ligatures w14:val="none"/>
-              </w:rPr>
-              <w:t> </w:t>
-            </w:r>
-          </w:p>
-        </w:tc>
-        <w:tc>
-          <w:tcPr>
-            <w:tcW w:w="1600" w:type="dxa"/>
-            <w:tcBorders>
-              <w:top w:val="nil"/>
-              <w:left w:val="nil"/>
-              <w:bottom w:val="single" w:sz="4" w:space="0" w:color="auto"/>
-              <w:right w:val="single" w:sz="4" w:space="0" w:color="auto"/>
-            </w:tcBorders>
-            <w:noWrap/>
-            <w:vAlign w:val="bottom"/>
-            <w:hideMark/>
-          </w:tcPr>
-          <w:p>
-            <w:pPr>
-              <w:spacing w:after="0" w:line="240" w:lineRule="auto"/>
-              <w:rPr>
-                <w:rFonts w:ascii="Calibri" w:eastAsia="Times New Roman" w:hAnsi="Calibri" w:cs="Calibri"/>
-                <w:color w:val="000000"/>
-                <w:kern w:val="0"/>
-                <w:lang w:eastAsia="en-GB"/>
-                <w14:ligatures w14:val="none"/>
-              </w:rPr>
-            </w:pPr>
-            <w:r>
-              <w:rPr>
-                <w:rFonts w:ascii="Calibri" w:eastAsia="Times New Roman" w:hAnsi="Calibri" w:cs="Calibri"/>
-                <w:color w:val="000000"/>
-                <w:kern w:val="0"/>
-                <w:lang w:eastAsia="en-GB"/>
-                <w14:ligatures w14:val="none"/>
-              </w:rPr>
-              <w:t> </w:t>
-            </w:r>
-          </w:p>
-        </w:tc>
-        <w:tc>
-          <w:tcPr>
-            <w:tcW w:w="1400" w:type="dxa"/>
-            <w:tcBorders>
-              <w:top w:val="nil"/>
-              <w:left w:val="nil"/>
-              <w:bottom w:val="single" w:sz="4" w:space="0" w:color="auto"/>
-              <w:right w:val="single" w:sz="4" w:space="0" w:color="auto"/>
-            </w:tcBorders>
-            <w:noWrap/>
-            <w:vAlign w:val="bottom"/>
-            <w:hideMark/>
-          </w:tcPr>
-          <w:p>
-            <w:pPr>
-              <w:spacing w:after="0" w:line="240" w:lineRule="auto"/>
-              <w:rPr>
-                <w:rFonts w:ascii="Calibri" w:eastAsia="Times New Roman" w:hAnsi="Calibri" w:cs="Calibri"/>
-                <w:color w:val="000000"/>
-                <w:kern w:val="0"/>
-                <w:lang w:eastAsia="en-GB"/>
-                <w14:ligatures w14:val="none"/>
-              </w:rPr>
-            </w:pPr>
-            <w:r>
-              <w:rPr>
-                <w:rFonts w:ascii="Calibri" w:eastAsia="Times New Roman" w:hAnsi="Calibri" w:cs="Calibri"/>
-                <w:color w:val="000000"/>
-                <w:kern w:val="0"/>
-                <w:lang w:eastAsia="en-GB"/>
-                <w14:ligatures w14:val="none"/>
-              </w:rPr>
-              <w:t> </w:t>
-            </w:r>
-          </w:p>
-        </w:tc>
-      </w:tr>
-    </w:tbl>
+    <w:p>
+      <w:r>
+        <w:drawing>
+          <wp:inline distT="0" distB="0" distL="0" distR="0" wp14:anchorId="643349FC" wp14:editId="70C6A5AE">
+            <wp:extent cx="5731510" cy="2009140"/>
+            <wp:effectExtent l="0" t="0" r="2540" b="0"/>
+            <wp:docPr id="1023632148" name="Picture 1"/>
+            <wp:cNvGraphicFramePr>
+              <a:graphicFrameLocks xmlns:a="http://schemas.openxmlformats.org/drawingml/2006/main" noChangeAspect="1"/>
+            </wp:cNvGraphicFramePr>
+            <a:graphic xmlns:a="http://schemas.openxmlformats.org/drawingml/2006/main">
+              <a:graphicData uri="http://schemas.openxmlformats.org/drawingml/2006/picture">
+                <pic:pic xmlns:pic="http://schemas.openxmlformats.org/drawingml/2006/picture">
+                  <pic:nvPicPr>
+                    <pic:cNvPr id="1023632148" name=""/>
+                    <pic:cNvPicPr/>
+                  </pic:nvPicPr>
+                  <pic:blipFill>
+                    <a:blip r:embed="rId5"/>
+                    <a:stretch>
+                      <a:fillRect/>
+                    </a:stretch>
+                  </pic:blipFill>
+                  <pic:spPr>
+                    <a:xfrm>
+                      <a:off x="0" y="0"/>
+                      <a:ext cx="5731510" cy="2009140"/>
+                    </a:xfrm>
+                    <a:prstGeom prst="rect">
+                      <a:avLst/>
+                    </a:prstGeom>
+                  </pic:spPr>
+                </pic:pic>
+              </a:graphicData>
+            </a:graphic>
+          </wp:inline>
+        </w:drawing>
+      </w:r>
+    </w:p>
     <w:p/>
     <w:sectPr>
       <w:pgSz w:w="11906" w:h="16838"/>

</xml_diff>

<commit_message>
standard deviation and variance hands on
</commit_message>
<xml_diff>
--- a/CKD - Analysis.docx
+++ b/CKD - Analysis.docx
@@ -1724,6 +1724,57 @@
         </w:drawing>
       </w:r>
     </w:p>
+    <w:p/>
+    <w:p>
+      <w:pPr>
+        <w:pStyle w:val="Heading2"/>
+      </w:pPr>
+      <w:r>
+        <w:t xml:space="preserve">Handling missing values – </w:t>
+      </w:r>
+      <w:proofErr w:type="spellStart"/>
+      <w:r>
+        <w:t>ckd</w:t>
+      </w:r>
+      <w:proofErr w:type="spellEnd"/>
+      <w:r>
+        <w:t xml:space="preserve"> </w:t>
+      </w:r>
+    </w:p>
+    <w:p>
+      <w:r>
+        <w:t xml:space="preserve">To handle missing values in the CKD dataset, I used the </w:t>
+      </w:r>
+      <w:proofErr w:type="spellStart"/>
+      <w:r>
+        <w:t>SimpleImputer</w:t>
+      </w:r>
+      <w:proofErr w:type="spellEnd"/>
+      <w:r>
+        <w:t xml:space="preserve"> from scikit-learn. For numerical features, </w:t>
+      </w:r>
+    </w:p>
+    <w:p>
+      <w:r>
+        <w:t xml:space="preserve">I chose the median strategy since medical data is often skewed and median is more robust to outliers. </w:t>
+      </w:r>
+    </w:p>
+    <w:p>
+      <w:r>
+        <w:t xml:space="preserve">For categorical features, I used the constant strategy and filled missing values with "Unknown" to preserve potential information </w:t>
+      </w:r>
+    </w:p>
+    <w:p>
+      <w:r>
+        <w:t>in the missingness pattern.</w:t>
+      </w:r>
+    </w:p>
+    <w:p>
+      <w:r>
+        <w:br w:type="page"/>
+      </w:r>
+    </w:p>
+    <w:p/>
     <w:p/>
     <w:sectPr>
       <w:pgSz w:w="11906" w:h="16838"/>

</xml_diff>